<commit_message>
Sincronização com o artefato do C.O (upstream/ + importador)
- upstream/: linha de base do artefato (versão 1791378621-d135, hashes,
  index.html redigido e calc.js) para comparar cada versão nova
- scripts/importar-artefato.mjs (npm run importar-artefato): calc.js,
  modelos DOCX/PDF higienizados e cadastro.json → data/*.json
- modelo DOCX regenerado pelo importador: tabela de exemplo vira
  {{TABELA_DE_PRECOS}}
- teste de modelos sem nomes/preços do cliente de exemplo (checagem
  genérica: capa só com marcador, nenhum preço fixo)
- docs/SINCRONIZAR-ARTEFATO.md com o prompt para o chat do C.O
  (substitui o guia de exportação) e CLAUDE.md com o procedimento

Co-Authored-By: Claude Opus 5.5 <noreply@anthropic.com>
</commit_message>
<xml_diff>
--- a/assets/modelo-proposta.docx
+++ b/assets/modelo-proposta.docx
@@ -936,246 +936,18 @@
     <w:tbl>
       <w:tblPr>
         <w:tblW w:w="5000" w:type="pct"/>
-        <w:jc w:val="center"/>
-        <w:tblBorders>
-          <w:top w:val="single" w:sz="4" w:space="0" w:color="000000"/>
-          <w:left w:val="single" w:sz="4" w:space="0" w:color="000000"/>
-          <w:bottom w:val="single" w:sz="4" w:space="0" w:color="000000"/>
-          <w:right w:val="single" w:sz="4" w:space="0" w:color="000000"/>
-          <w:insideH w:val="single" w:sz="4" w:space="0" w:color="000000"/>
-          <w:insideV w:val="single" w:sz="4" w:space="0" w:color="000000"/>
-        </w:tblBorders>
-        <w:shd w:val="clear" w:color="auto" w:fill="D3D3D3"/>
-        <w:tblLook w:val="04A0" w:firstRow="1" w:lastRow="0" w:firstColumn="1" w:lastColumn="0" w:noHBand="0" w:noVBand="1"/>
       </w:tblPr>
       <w:tblGrid>
-        <w:gridCol w:w="747"/>
-        <w:gridCol w:w="6396"/>
-        <w:gridCol w:w="1919"/>
+        <w:gridCol w:w="9067"/>
       </w:tblGrid>
       <w:tr>
-        <w:trPr>
-          <w:tblHeader/>
-          <w:jc w:val="center"/>
-        </w:trPr>
         <w:tc>
           <w:tcPr>
-            <w:tcW w:w="412" w:type="pct"/>
-            <w:shd w:val="clear" w:color="auto" w:fill="D3D3D3"/>
-            <w:vAlign w:val="center"/>
-          </w:tcPr>
-          <w:p>
-            <w:pPr>
-              <w:jc w:val="center"/>
-            </w:pPr>
-            <w:r>
-              <w:rPr>
-                <w:b/>
-              </w:rPr>
-              <w:t>Qtd.</w:t>
-            </w:r>
-          </w:p>
-        </w:tc>
-        <w:tc>
-          <w:tcPr>
-            <w:tcW w:w="3529" w:type="pct"/>
-            <w:shd w:val="clear" w:color="auto" w:fill="D3D3D3"/>
-            <w:vAlign w:val="center"/>
-          </w:tcPr>
-          <w:p>
-            <w:pPr>
-              <w:jc w:val="center"/>
-            </w:pPr>
-            <w:r>
-              <w:rPr>
-                <w:b/>
-              </w:rPr>
-              <w:t>Descrição</w:t>
-            </w:r>
-          </w:p>
-        </w:tc>
-        <w:tc>
-          <w:tcPr>
-            <w:tcW w:w="1059" w:type="pct"/>
-            <w:shd w:val="clear" w:color="auto" w:fill="D3D3D3"/>
-            <w:vAlign w:val="center"/>
-          </w:tcPr>
-          <w:p>
-            <w:pPr>
-              <w:jc w:val="center"/>
-            </w:pPr>
-            <w:r>
-              <w:rPr>
-                <w:b/>
-              </w:rPr>
-              <w:t>Vl. Total</w:t>
-            </w:r>
-          </w:p>
-        </w:tc>
-      </w:tr>
-      <w:tr>
-        <w:tblPrEx>
-          <w:shd w:val="clear" w:color="auto" w:fill="FFFFFF"/>
-        </w:tblPrEx>
-        <w:trPr>
-          <w:jc w:val="center"/>
-        </w:trPr>
-        <w:tc>
-          <w:tcPr>
-            <w:tcW w:w="412" w:type="pct"/>
-            <w:shd w:val="clear" w:color="auto" w:fill="FFFFFF"/>
-            <w:vAlign w:val="center"/>
-          </w:tcPr>
-          <w:p>
-            <w:pPr>
-              <w:jc w:val="center"/>
-            </w:pPr>
-            <w:r>
-              <w:t>1</w:t>
-            </w:r>
-          </w:p>
-        </w:tc>
-        <w:tc>
-          <w:tcPr>
-            <w:tcW w:w="3529" w:type="pct"/>
-            <w:shd w:val="clear" w:color="auto" w:fill="FFFFFF"/>
-            <w:vAlign w:val="center"/>
+            <w:tcW w:w="5000" w:type="pct"/>
           </w:tcPr>
           <w:p>
             <w:r>
-              <w:rPr>
-                <w:sz w:val="20"/>
-              </w:rPr>
-              <w:t>{{FUNCAO_EXEMPLO}}</w:t>
-            </w:r>
-          </w:p>
-        </w:tc>
-        <w:tc>
-          <w:tcPr>
-            <w:tcW w:w="1059" w:type="pct"/>
-            <w:shd w:val="clear" w:color="auto" w:fill="FFFFFF"/>
-            <w:vAlign w:val="center"/>
-          </w:tcPr>
-          <w:p>
-            <w:pPr>
-              <w:jc w:val="right"/>
-            </w:pPr>
-            <w:r>
-              <w:rPr>
-                <w:sz w:val="20"/>
-              </w:rPr>
-              <w:t xml:space="preserve">R$ 0,00</w:t>
-            </w:r>
-          </w:p>
-        </w:tc>
-      </w:tr>
-      <w:tr>
-        <w:tblPrEx>
-          <w:shd w:val="clear" w:color="auto" w:fill="FFFFFF"/>
-        </w:tblPrEx>
-        <w:trPr>
-          <w:jc w:val="center"/>
-        </w:trPr>
-        <w:tc>
-          <w:tcPr>
-            <w:tcW w:w="412" w:type="pct"/>
-            <w:shd w:val="clear" w:color="auto" w:fill="FFFFFF"/>
-            <w:vAlign w:val="center"/>
-          </w:tcPr>
-          <w:p>
-            <w:pPr>
-              <w:jc w:val="center"/>
-            </w:pPr>
-            <w:r>
-              <w:t>2</w:t>
-            </w:r>
-          </w:p>
-        </w:tc>
-        <w:tc>
-          <w:tcPr>
-            <w:tcW w:w="3529" w:type="pct"/>
-            <w:shd w:val="clear" w:color="auto" w:fill="FFFFFF"/>
-            <w:vAlign w:val="center"/>
-          </w:tcPr>
-          <w:p>
-            <w:pPr>
-              <w:rPr>
-                <w:sz w:val="20"/>
-              </w:rPr>
-            </w:pPr>
-            <w:r>
-              <w:rPr>
-                <w:sz w:val="20"/>
-              </w:rPr>
-              <w:t>{{FUNCAO_EXEMPLO}}</w:t>
-            </w:r>
-          </w:p>
-        </w:tc>
-        <w:tc>
-          <w:tcPr>
-            <w:tcW w:w="1059" w:type="pct"/>
-            <w:shd w:val="clear" w:color="auto" w:fill="FFFFFF"/>
-            <w:vAlign w:val="center"/>
-          </w:tcPr>
-          <w:p>
-            <w:pPr>
-              <w:jc w:val="right"/>
-              <w:rPr>
-                <w:sz w:val="20"/>
-              </w:rPr>
-            </w:pPr>
-            <w:r>
-              <w:rPr>
-                <w:sz w:val="20"/>
-              </w:rPr>
-              <w:t>R$ 0,00</w:t>
-            </w:r>
-          </w:p>
-        </w:tc>
-      </w:tr>
-      <w:tr>
-        <w:tblPrEx>
-          <w:shd w:val="clear" w:color="auto" w:fill="FFFFFF"/>
-        </w:tblPrEx>
-        <w:trPr>
-          <w:jc w:val="center"/>
-        </w:trPr>
-        <w:tc>
-          <w:tcPr>
-            <w:tcW w:w="3941" w:type="pct"/>
-            <w:gridSpan w:val="2"/>
-            <w:shd w:val="clear" w:color="auto" w:fill="FFFFFF"/>
-            <w:vAlign w:val="center"/>
-          </w:tcPr>
-          <w:p>
-            <w:pPr>
-              <w:jc w:val="right"/>
-            </w:pPr>
-            <w:r>
-              <w:rPr>
-                <w:b/>
-                <w:sz w:val="20"/>
-              </w:rPr>
-              <w:t>Total de Serviços</w:t>
-            </w:r>
-          </w:p>
-        </w:tc>
-        <w:tc>
-          <w:tcPr>
-            <w:tcW w:w="1059" w:type="pct"/>
-            <w:shd w:val="clear" w:color="auto" w:fill="FFFFFF"/>
-            <w:vAlign w:val="center"/>
-          </w:tcPr>
-          <w:p>
-            <w:pPr>
-              <w:jc w:val="right"/>
-            </w:pPr>
-            <w:r>
-              <w:rPr>
-                <w:b/>
-                <w:sz w:val="20"/>
-              </w:rPr>
-              <w:t xml:space="preserve">R$ 0,00</w:t>
+              <w:t>{{TABELA_DE_PRECOS}}</w:t>
             </w:r>
           </w:p>
         </w:tc>

</xml_diff>

<commit_message>
Sincronização com o artefato do C.O (upstream/ + importador) (#10)
- upstream/: linha de base do artefato (versão 1791378621-d135, hashes,
  index.html redigido e calc.js) para comparar cada versão nova
- scripts/importar-artefato.mjs (npm run importar-artefato): calc.js,
  modelos DOCX/PDF higienizados e cadastro.json → data/*.json
- modelo DOCX regenerado pelo importador: tabela de exemplo vira
  {{TABELA_DE_PRECOS}}
- teste de modelos sem nomes/preços do cliente de exemplo (checagem
  genérica: capa só com marcador, nenhum preço fixo)
- docs/SINCRONIZAR-ARTEFATO.md com o prompt para o chat do C.O
  (substitui o guia de exportação) e CLAUDE.md com o procedimento

Co-authored-by: Claude Opus 5.5 <noreply@anthropic.com>
</commit_message>
<xml_diff>
--- a/assets/modelo-proposta.docx
+++ b/assets/modelo-proposta.docx
@@ -936,246 +936,18 @@
     <w:tbl>
       <w:tblPr>
         <w:tblW w:w="5000" w:type="pct"/>
-        <w:jc w:val="center"/>
-        <w:tblBorders>
-          <w:top w:val="single" w:sz="4" w:space="0" w:color="000000"/>
-          <w:left w:val="single" w:sz="4" w:space="0" w:color="000000"/>
-          <w:bottom w:val="single" w:sz="4" w:space="0" w:color="000000"/>
-          <w:right w:val="single" w:sz="4" w:space="0" w:color="000000"/>
-          <w:insideH w:val="single" w:sz="4" w:space="0" w:color="000000"/>
-          <w:insideV w:val="single" w:sz="4" w:space="0" w:color="000000"/>
-        </w:tblBorders>
-        <w:shd w:val="clear" w:color="auto" w:fill="D3D3D3"/>
-        <w:tblLook w:val="04A0" w:firstRow="1" w:lastRow="0" w:firstColumn="1" w:lastColumn="0" w:noHBand="0" w:noVBand="1"/>
       </w:tblPr>
       <w:tblGrid>
-        <w:gridCol w:w="747"/>
-        <w:gridCol w:w="6396"/>
-        <w:gridCol w:w="1919"/>
+        <w:gridCol w:w="9067"/>
       </w:tblGrid>
       <w:tr>
-        <w:trPr>
-          <w:tblHeader/>
-          <w:jc w:val="center"/>
-        </w:trPr>
         <w:tc>
           <w:tcPr>
-            <w:tcW w:w="412" w:type="pct"/>
-            <w:shd w:val="clear" w:color="auto" w:fill="D3D3D3"/>
-            <w:vAlign w:val="center"/>
-          </w:tcPr>
-          <w:p>
-            <w:pPr>
-              <w:jc w:val="center"/>
-            </w:pPr>
-            <w:r>
-              <w:rPr>
-                <w:b/>
-              </w:rPr>
-              <w:t>Qtd.</w:t>
-            </w:r>
-          </w:p>
-        </w:tc>
-        <w:tc>
-          <w:tcPr>
-            <w:tcW w:w="3529" w:type="pct"/>
-            <w:shd w:val="clear" w:color="auto" w:fill="D3D3D3"/>
-            <w:vAlign w:val="center"/>
-          </w:tcPr>
-          <w:p>
-            <w:pPr>
-              <w:jc w:val="center"/>
-            </w:pPr>
-            <w:r>
-              <w:rPr>
-                <w:b/>
-              </w:rPr>
-              <w:t>Descrição</w:t>
-            </w:r>
-          </w:p>
-        </w:tc>
-        <w:tc>
-          <w:tcPr>
-            <w:tcW w:w="1059" w:type="pct"/>
-            <w:shd w:val="clear" w:color="auto" w:fill="D3D3D3"/>
-            <w:vAlign w:val="center"/>
-          </w:tcPr>
-          <w:p>
-            <w:pPr>
-              <w:jc w:val="center"/>
-            </w:pPr>
-            <w:r>
-              <w:rPr>
-                <w:b/>
-              </w:rPr>
-              <w:t>Vl. Total</w:t>
-            </w:r>
-          </w:p>
-        </w:tc>
-      </w:tr>
-      <w:tr>
-        <w:tblPrEx>
-          <w:shd w:val="clear" w:color="auto" w:fill="FFFFFF"/>
-        </w:tblPrEx>
-        <w:trPr>
-          <w:jc w:val="center"/>
-        </w:trPr>
-        <w:tc>
-          <w:tcPr>
-            <w:tcW w:w="412" w:type="pct"/>
-            <w:shd w:val="clear" w:color="auto" w:fill="FFFFFF"/>
-            <w:vAlign w:val="center"/>
-          </w:tcPr>
-          <w:p>
-            <w:pPr>
-              <w:jc w:val="center"/>
-            </w:pPr>
-            <w:r>
-              <w:t>1</w:t>
-            </w:r>
-          </w:p>
-        </w:tc>
-        <w:tc>
-          <w:tcPr>
-            <w:tcW w:w="3529" w:type="pct"/>
-            <w:shd w:val="clear" w:color="auto" w:fill="FFFFFF"/>
-            <w:vAlign w:val="center"/>
+            <w:tcW w:w="5000" w:type="pct"/>
           </w:tcPr>
           <w:p>
             <w:r>
-              <w:rPr>
-                <w:sz w:val="20"/>
-              </w:rPr>
-              <w:t>{{FUNCAO_EXEMPLO}}</w:t>
-            </w:r>
-          </w:p>
-        </w:tc>
-        <w:tc>
-          <w:tcPr>
-            <w:tcW w:w="1059" w:type="pct"/>
-            <w:shd w:val="clear" w:color="auto" w:fill="FFFFFF"/>
-            <w:vAlign w:val="center"/>
-          </w:tcPr>
-          <w:p>
-            <w:pPr>
-              <w:jc w:val="right"/>
-            </w:pPr>
-            <w:r>
-              <w:rPr>
-                <w:sz w:val="20"/>
-              </w:rPr>
-              <w:t xml:space="preserve">R$ 0,00</w:t>
-            </w:r>
-          </w:p>
-        </w:tc>
-      </w:tr>
-      <w:tr>
-        <w:tblPrEx>
-          <w:shd w:val="clear" w:color="auto" w:fill="FFFFFF"/>
-        </w:tblPrEx>
-        <w:trPr>
-          <w:jc w:val="center"/>
-        </w:trPr>
-        <w:tc>
-          <w:tcPr>
-            <w:tcW w:w="412" w:type="pct"/>
-            <w:shd w:val="clear" w:color="auto" w:fill="FFFFFF"/>
-            <w:vAlign w:val="center"/>
-          </w:tcPr>
-          <w:p>
-            <w:pPr>
-              <w:jc w:val="center"/>
-            </w:pPr>
-            <w:r>
-              <w:t>2</w:t>
-            </w:r>
-          </w:p>
-        </w:tc>
-        <w:tc>
-          <w:tcPr>
-            <w:tcW w:w="3529" w:type="pct"/>
-            <w:shd w:val="clear" w:color="auto" w:fill="FFFFFF"/>
-            <w:vAlign w:val="center"/>
-          </w:tcPr>
-          <w:p>
-            <w:pPr>
-              <w:rPr>
-                <w:sz w:val="20"/>
-              </w:rPr>
-            </w:pPr>
-            <w:r>
-              <w:rPr>
-                <w:sz w:val="20"/>
-              </w:rPr>
-              <w:t>{{FUNCAO_EXEMPLO}}</w:t>
-            </w:r>
-          </w:p>
-        </w:tc>
-        <w:tc>
-          <w:tcPr>
-            <w:tcW w:w="1059" w:type="pct"/>
-            <w:shd w:val="clear" w:color="auto" w:fill="FFFFFF"/>
-            <w:vAlign w:val="center"/>
-          </w:tcPr>
-          <w:p>
-            <w:pPr>
-              <w:jc w:val="right"/>
-              <w:rPr>
-                <w:sz w:val="20"/>
-              </w:rPr>
-            </w:pPr>
-            <w:r>
-              <w:rPr>
-                <w:sz w:val="20"/>
-              </w:rPr>
-              <w:t>R$ 0,00</w:t>
-            </w:r>
-          </w:p>
-        </w:tc>
-      </w:tr>
-      <w:tr>
-        <w:tblPrEx>
-          <w:shd w:val="clear" w:color="auto" w:fill="FFFFFF"/>
-        </w:tblPrEx>
-        <w:trPr>
-          <w:jc w:val="center"/>
-        </w:trPr>
-        <w:tc>
-          <w:tcPr>
-            <w:tcW w:w="3941" w:type="pct"/>
-            <w:gridSpan w:val="2"/>
-            <w:shd w:val="clear" w:color="auto" w:fill="FFFFFF"/>
-            <w:vAlign w:val="center"/>
-          </w:tcPr>
-          <w:p>
-            <w:pPr>
-              <w:jc w:val="right"/>
-            </w:pPr>
-            <w:r>
-              <w:rPr>
-                <w:b/>
-                <w:sz w:val="20"/>
-              </w:rPr>
-              <w:t>Total de Serviços</w:t>
-            </w:r>
-          </w:p>
-        </w:tc>
-        <w:tc>
-          <w:tcPr>
-            <w:tcW w:w="1059" w:type="pct"/>
-            <w:shd w:val="clear" w:color="auto" w:fill="FFFFFF"/>
-            <w:vAlign w:val="center"/>
-          </w:tcPr>
-          <w:p>
-            <w:pPr>
-              <w:jc w:val="right"/>
-            </w:pPr>
-            <w:r>
-              <w:rPr>
-                <w:b/>
-                <w:sz w:val="20"/>
-              </w:rPr>
-              <w:t xml:space="preserve">R$ 0,00</w:t>
+              <w:t>{{TABELA_DE_PRECOS}}</w:t>
             </w:r>
           </w:p>
         </w:tc>

</xml_diff>